<commit_message>
V4: notebook 4.7 extensions (cost scan ranking inversion + recalibration loop 0.221->0.089), case report academic re-typeset (three-line tables, CN/EN abstracts, GB/T 7714 refs)
</commit_message>
<xml_diff>
--- a/teaching_doc/案例设计说明.docx
+++ b/teaching_doc/案例设计说明.docx
@@ -1468,6 +1468,56 @@
                 <w:sz w:val="21"/>
               </w:rPr>
               <w:t>识别结论成立的参数范围（含反事实）</w:t>
+            </w:r>
+          </w:p>
+        </w:tc>
+      </w:tr>
+      <w:tr>
+        <w:tc>
+          <w:tcPr>
+            <w:tcW w:type="dxa" w:w="1701"/>
+          </w:tcPr>
+          <w:p>
+            <w:r/>
+            <w:r>
+              <w:rPr>
+                <w:rFonts w:ascii="Times New Roman" w:hAnsi="Times New Roman" w:eastAsia="宋体"/>
+                <w:b w:val="0"/>
+                <w:sz w:val="21"/>
+              </w:rPr>
+              <w:t>拓展分析</w:t>
+            </w:r>
+          </w:p>
+        </w:tc>
+        <w:tc>
+          <w:tcPr>
+            <w:tcW w:type="dxa" w:w="4195"/>
+          </w:tcPr>
+          <w:p>
+            <w:r/>
+            <w:r>
+              <w:rPr>
+                <w:rFonts w:ascii="Times New Roman" w:hAnsi="Times New Roman" w:eastAsia="宋体"/>
+                <w:b w:val="0"/>
+                <w:sz w:val="21"/>
+              </w:rPr>
+              <w:t>交易成本扫描（0–10bp）；置信度再校准闭环（样本内校准 → 样本外验证）</w:t>
+            </w:r>
+          </w:p>
+        </w:tc>
+        <w:tc>
+          <w:tcPr>
+            <w:tcW w:type="dxa" w:w="3742"/>
+          </w:tcPr>
+          <w:p>
+            <w:r/>
+            <w:r>
+              <w:rPr>
+                <w:rFonts w:ascii="Times New Roman" w:hAnsi="Times New Roman" w:eastAsia="宋体"/>
+                <w:b w:val="0"/>
+                <w:sz w:val="21"/>
+              </w:rPr>
+              <w:t>检验结论对成本参数的稳健性；量化“校准能修复什么、不能修复什么”</w:t>
             </w:r>
           </w:p>
         </w:tc>

</xml_diff>